<commit_message>
Nine conditional topology-communication patterns
</commit_message>
<xml_diff>
--- a/docs/25-Thesis-Topic-Shaping.docx
+++ b/docs/25-Thesis-Topic-Shaping.docx
@@ -4229,6 +4229,1721 @@
       <w:proofErr w:type="spellEnd"/>
       <w:r>
         <w:t>) is correct for the demo. Live with the occasional manual retry until the freeze; it's the price of clean prompts.</w:t>
+      </w:r>
+    </w:p>
+    <w:p>
+      <w:pPr>
+        <w:pBdr>
+          <w:bottom w:val="single" w:sz="6" w:space="1" w:color="auto"/>
+        </w:pBdr>
+      </w:pPr>
+    </w:p>
+    <w:p/>
+    <w:p>
+      <w:r>
+        <w:t>Gpt-5.4-mini test:</w:t>
+      </w:r>
+    </w:p>
+    <w:p>
+      <w:pPr>
+        <w:rPr>
+          <w:b/>
+          <w:bCs/>
+        </w:rPr>
+      </w:pPr>
+    </w:p>
+    <w:p>
+      <w:pPr>
+        <w:rPr>
+          <w:b/>
+          <w:bCs/>
+        </w:rPr>
+      </w:pPr>
+      <w:r>
+        <w:rPr>
+          <w:b/>
+          <w:bCs/>
+        </w:rPr>
+        <w:t xml:space="preserve">From </w:t>
+      </w:r>
+      <w:proofErr w:type="gramStart"/>
+      <w:r>
+        <w:rPr>
+          <w:b/>
+          <w:bCs/>
+        </w:rPr>
+        <w:t>run_once.py :</w:t>
+      </w:r>
+      <w:proofErr w:type="gramEnd"/>
+      <w:r>
+        <w:rPr>
+          <w:b/>
+          <w:bCs/>
+        </w:rPr>
+        <w:t xml:space="preserve"> with predict and diagnosis query.</w:t>
+      </w:r>
+    </w:p>
+    <w:p>
+      <w:pPr>
+        <w:rPr>
+          <w:b/>
+          <w:bCs/>
+        </w:rPr>
+      </w:pPr>
+      <w:r>
+        <w:rPr>
+          <w:b/>
+          <w:bCs/>
+        </w:rPr>
+        <w:t>It ran predict, diagnosis and simulation (although that was not asked).</w:t>
+      </w:r>
+    </w:p>
+    <w:p/>
+    <w:p>
+      <w:r>
+        <w:t xml:space="preserve">That log </w:t>
+      </w:r>
+      <w:proofErr w:type="gramStart"/>
+      <w:r>
+        <w:t>actually shows</w:t>
+      </w:r>
+      <w:proofErr w:type="gramEnd"/>
+      <w:r>
+        <w:t xml:space="preserve"> something more interesting than "no prediction" — </w:t>
+      </w:r>
+      <w:proofErr w:type="spellStart"/>
+      <w:r>
+        <w:t>predict_delivery_delays_tool</w:t>
+      </w:r>
+      <w:proofErr w:type="spellEnd"/>
+      <w:r>
+        <w:t xml:space="preserve"> did run successfully (29.20s, 16,741 chars out, valid JSON). The real anomaly: only predict + diagnose were asked for, but the master also invoked </w:t>
+      </w:r>
+      <w:proofErr w:type="spellStart"/>
+      <w:r>
+        <w:t>delay_simulations_tool</w:t>
+      </w:r>
+      <w:proofErr w:type="spellEnd"/>
+      <w:r>
+        <w:t xml:space="preserve"> with a scenario ("stormy weather scenario for the west region on express deliveries") that was never requested anywhere in the query. That's a hallucinated extra tool call, not a missing one. Let me check whether the master's system prompt contains an example that gpt-5.4-mini might be copying verbatim instead of treating as illustrative.</w:t>
+      </w:r>
+    </w:p>
+    <w:p>
+      <w:r>
+        <w:t>Read a file, searched code</w:t>
+      </w:r>
+    </w:p>
+    <w:p>
+      <w:r>
+        <w:t>Read a file, searched code</w:t>
+      </w:r>
+    </w:p>
+    <w:p/>
+    <w:p>
+      <w:r>
+        <w:t xml:space="preserve">Found it — line 210 of master_expert.md: </w:t>
+      </w:r>
+      <w:r>
+        <w:rPr>
+          <w:i/>
+          <w:iCs/>
+        </w:rPr>
+        <w:t>"When in doubt about whether to call a tool, CALL IT. It is better to provide extra analysis than to skip a tool the user expected."</w:t>
+      </w:r>
+    </w:p>
+    <w:p/>
+    <w:p>
+      <w:r>
+        <w:t xml:space="preserve">That instruction is almost certainly the trigger. It's a deliberately permissive rule written for a frontier model that's expected to have good judgment about what counts as "in doubt." gpt-5.4-mini appears to be taking it far more literally — the query only asked for predict + diagnose, but the master went ahead and called </w:t>
+      </w:r>
+      <w:proofErr w:type="spellStart"/>
+      <w:r>
+        <w:t>delay_simulations_tool</w:t>
+      </w:r>
+      <w:proofErr w:type="spellEnd"/>
+      <w:r>
+        <w:t xml:space="preserve"> anyway, inventing a fully specific scenario ("stormy weather, west region, express deliveries") that appears nowhere in your query, the system prompt, or any example text I could find (I grepped for "west region"/"stormy weather scenario" across the app — no literal match, so this isn't copied from a template; the model genuinely fabricated those parameter values from scratch). Recommend and email, which also weren't asked for, correctly did </w:t>
+      </w:r>
+      <w:r>
+        <w:rPr>
+          <w:i/>
+          <w:iCs/>
+        </w:rPr>
+        <w:t>not</w:t>
+      </w:r>
+      <w:r>
+        <w:t xml:space="preserve"> get called — so it's not simply "call everything," it's specifically over-triggering on simulate in a way that's hard to fully explain, but the permissive "when in doubt, call it" line combined with weaker instruction-following at the mini tier is the most plausible mechanism.</w:t>
+      </w:r>
+    </w:p>
+    <w:p/>
+    <w:p>
+      <w:r>
+        <w:t xml:space="preserve">Important methodological point: I'd recommend </w:t>
+      </w:r>
+      <w:r>
+        <w:rPr>
+          <w:b/>
+          <w:bCs/>
+        </w:rPr>
+        <w:t>not</w:t>
+      </w:r>
+      <w:r>
+        <w:t xml:space="preserve"> patching the prompt to compensate for this. The whole point of the model-tiering axis is holding the prompt/instructions fixed and varying only the model — if you tune master_expert.md around gpt-5.4-mini's specific quirks, you've broken the controlled comparison, because gpt-5.4 was never tested against the same tuned prompt. This is exactly the kind of thing worth recording as a finding rather than fixing: gpt-5.4-mini, under identical instructions, produces an unrequested tool call with fabricated parameters, while the frontier model doesn't. That's a real reliability delta, not a bug in your code.</w:t>
+      </w:r>
+    </w:p>
+    <w:p/>
+    <w:p>
+      <w:r>
+        <w:t>Want me to log this as a specific observation in the tracker (tied to T23's known-gaps note, or as its own line), or do you want to run a couple more queries against gpt-5.4-mini first to see if this is consistent before writing it down?</w:t>
+      </w:r>
+    </w:p>
+    <w:p/>
+    <w:p>
+      <w:pPr>
+        <w:rPr>
+          <w:b/>
+          <w:bCs/>
+        </w:rPr>
+      </w:pPr>
+      <w:r>
+        <w:rPr>
+          <w:b/>
+          <w:bCs/>
+        </w:rPr>
+        <w:t>From UI:</w:t>
+      </w:r>
+      <w:r>
+        <w:rPr>
+          <w:b/>
+          <w:bCs/>
+        </w:rPr>
+        <w:t xml:space="preserve"> Run full analysis.</w:t>
+      </w:r>
+    </w:p>
+    <w:p>
+      <w:pPr>
+        <w:rPr>
+          <w:b/>
+          <w:bCs/>
+        </w:rPr>
+      </w:pPr>
+      <w:r>
+        <w:rPr>
+          <w:b/>
+          <w:bCs/>
+        </w:rPr>
+        <w:t xml:space="preserve">Only predict ran. </w:t>
+      </w:r>
+      <w:proofErr w:type="spellStart"/>
+      <w:r>
+        <w:rPr>
+          <w:b/>
+          <w:bCs/>
+        </w:rPr>
+        <w:t>Llm_insights</w:t>
+      </w:r>
+      <w:proofErr w:type="spellEnd"/>
+      <w:r>
+        <w:rPr>
+          <w:b/>
+          <w:bCs/>
+        </w:rPr>
+        <w:t xml:space="preserve"> not populated. No errors anywhere.</w:t>
+      </w:r>
+    </w:p>
+    <w:p/>
+    <w:p>
+      <w:r>
+        <w:t>Two distinct failure modes here, worth separating rather than treating as one bug — let me check the predict agent's schema first to see whether hypothesis (a) below actually holds up.</w:t>
+      </w:r>
+    </w:p>
+    <w:p/>
+    <w:p>
+      <w:r>
+        <w:t xml:space="preserve">That schema explains the predict-partial issue cleanly. </w:t>
+      </w:r>
+      <w:proofErr w:type="spellStart"/>
+      <w:r>
+        <w:t>RowEnrichment.llm_insights</w:t>
+      </w:r>
+      <w:proofErr w:type="spellEnd"/>
+      <w:r>
+        <w:t xml:space="preserve"> has </w:t>
+      </w:r>
+      <w:proofErr w:type="spellStart"/>
+      <w:r>
+        <w:t>min_length</w:t>
+      </w:r>
+      <w:proofErr w:type="spellEnd"/>
+      <w:r>
+        <w:t xml:space="preserve">=10 — a hard per-row constraint — and </w:t>
+      </w:r>
+      <w:proofErr w:type="spellStart"/>
+      <w:r>
+        <w:t>DeliveryDelayPredictionResult.delayed_orders</w:t>
+      </w:r>
+      <w:proofErr w:type="spellEnd"/>
+      <w:r>
+        <w:t xml:space="preserve"> needs one such entry per delayed row, capped at 50 (</w:t>
+      </w:r>
+      <w:proofErr w:type="spellStart"/>
+      <w:r>
+        <w:t>enrich_rows_cap</w:t>
+      </w:r>
+      <w:proofErr w:type="spellEnd"/>
+      <w:r>
+        <w:t xml:space="preserve">). That means a single structured-output call </w:t>
+      </w:r>
+      <w:proofErr w:type="gramStart"/>
+      <w:r>
+        <w:t>has to</w:t>
+      </w:r>
+      <w:proofErr w:type="gramEnd"/>
+      <w:r>
+        <w:t xml:space="preserve"> produce ~50 </w:t>
+      </w:r>
+      <w:proofErr w:type="gramStart"/>
+      <w:r>
+        <w:t>individually-valid</w:t>
+      </w:r>
+      <w:proofErr w:type="gramEnd"/>
+      <w:r>
+        <w:t xml:space="preserve"> 1-2 sentence insights in one completion. A weaker/mini-tier model plausibly runs out of generation quality or attention partway through a completion that long — the first handful of rows get real insights, then it either stops adding rows (list ends up short, matching "1-3 records") or the whole </w:t>
+      </w:r>
+      <w:proofErr w:type="spellStart"/>
+      <w:r>
+        <w:t>delayed_orders</w:t>
+      </w:r>
+      <w:proofErr w:type="spellEnd"/>
+      <w:r>
+        <w:t xml:space="preserve"> list falls back to its </w:t>
+      </w:r>
+      <w:proofErr w:type="spellStart"/>
+      <w:r>
+        <w:t>default_factory</w:t>
+      </w:r>
+      <w:proofErr w:type="spellEnd"/>
+      <w:r>
+        <w:t>=list empty default when the model can't satisfy the schema at all (matching "skipped altogether"). This is architecturally exactly the kind of failure your context-window/output-budget theory predicts, and it's consistent between gpt-4.1-mini and gpt-5.4-mini — good, that consistency itself is useful evidence it's a real tier-dependent effect, not noise.</w:t>
+      </w:r>
+    </w:p>
+    <w:p/>
+    <w:p>
+      <w:r>
+        <w:t xml:space="preserve">The second part — diagnose/simulate/recommend/email not running at all — is a different failure, at the master level rather than inside predict. The master's </w:t>
+      </w:r>
+      <w:proofErr w:type="spellStart"/>
+      <w:r>
+        <w:t>tool_choice</w:t>
+      </w:r>
+      <w:proofErr w:type="spellEnd"/>
+      <w:r>
+        <w:t xml:space="preserve"> is set to "auto" (not "required"), so at every step it's free to decide it's "done" and </w:t>
+      </w:r>
+      <w:r>
+        <w:lastRenderedPageBreak/>
+        <w:t xml:space="preserve">return </w:t>
+      </w:r>
+      <w:proofErr w:type="spellStart"/>
+      <w:r>
+        <w:t>MasterOutput</w:t>
+      </w:r>
+      <w:proofErr w:type="spellEnd"/>
+      <w:r>
+        <w:t xml:space="preserve"> instead of continuing. master_expert.md is a 216-line prompt with the full-workflow requirement stated in Section 7, but that's a lot of instruction for the model to keep attending to across multiple sequential tool-calling turns, especially after </w:t>
+      </w:r>
+      <w:proofErr w:type="spellStart"/>
+      <w:r>
+        <w:t>predict's</w:t>
+      </w:r>
+      <w:proofErr w:type="spellEnd"/>
+      <w:r>
+        <w:t xml:space="preserve"> own tool output alone is 16K+ characters added to the conversation. A plausible mechanism: gpt-5.4-mini loses track of "this was a full-workflow request, keep going" after the first tool call and just stops. But I don't want to assert that confidently without seeing what </w:t>
+      </w:r>
+      <w:proofErr w:type="gramStart"/>
+      <w:r>
+        <w:t>actually happened</w:t>
+      </w:r>
+      <w:proofErr w:type="gramEnd"/>
+      <w:r>
+        <w:t xml:space="preserve"> — could paste the relevant lines from that run's log file (</w:t>
+      </w:r>
+      <w:proofErr w:type="spellStart"/>
+      <w:r>
+        <w:t>sc_delivery_thesis_app</w:t>
+      </w:r>
+      <w:proofErr w:type="spellEnd"/>
+      <w:r>
+        <w:t>/log/</w:t>
+      </w:r>
+      <w:proofErr w:type="spellStart"/>
+      <w:r>
+        <w:t>delivery_chat_run</w:t>
+      </w:r>
+      <w:proofErr w:type="spellEnd"/>
+      <w:r>
+        <w:t xml:space="preserve">_*.log, the most recent one)? </w:t>
+      </w:r>
+      <w:proofErr w:type="gramStart"/>
+      <w:r>
+        <w:t>Specifically</w:t>
+      </w:r>
+      <w:proofErr w:type="gramEnd"/>
+      <w:r>
+        <w:t xml:space="preserve"> the </w:t>
+      </w:r>
+      <w:proofErr w:type="spellStart"/>
+      <w:r>
+        <w:t>tool.call.started</w:t>
+      </w:r>
+      <w:proofErr w:type="spellEnd"/>
+      <w:r>
+        <w:t>/</w:t>
+      </w:r>
+      <w:proofErr w:type="spellStart"/>
+      <w:r>
+        <w:t>tool.call.completed</w:t>
+      </w:r>
+      <w:proofErr w:type="spellEnd"/>
+      <w:r>
+        <w:t xml:space="preserve"> lines and whatever </w:t>
+      </w:r>
+      <w:proofErr w:type="spellStart"/>
+      <w:proofErr w:type="gramStart"/>
+      <w:r>
+        <w:t>run.outputs</w:t>
+      </w:r>
+      <w:proofErr w:type="spellEnd"/>
+      <w:proofErr w:type="gramEnd"/>
+      <w:r>
+        <w:t xml:space="preserve">/final </w:t>
+      </w:r>
+      <w:proofErr w:type="spellStart"/>
+      <w:r>
+        <w:t>chat_response</w:t>
+      </w:r>
+      <w:proofErr w:type="spellEnd"/>
+      <w:r>
+        <w:t xml:space="preserve"> got logged — that'll show whether it explicitly stopped after one tool call or attempted something that failed silently.</w:t>
+      </w:r>
+    </w:p>
+    <w:p/>
+    <w:p>
+      <w:r>
+        <w:t>Same guidance as before applies to both: don't patch master_expert.md to work around either issue specifically for the mini tier — that would break the fixed-prompt-varying-model comparison. This is turning into good, well-grounded data: gpt-5.4-mini reliably degrades on long-output structured tasks (</w:t>
+      </w:r>
+      <w:proofErr w:type="spellStart"/>
+      <w:r>
+        <w:t>predict's</w:t>
+      </w:r>
+      <w:proofErr w:type="spellEnd"/>
+      <w:r>
+        <w:t xml:space="preserve"> per-row insights) and on sustaining multi-step tool-calling plans (the full workflow), while occasionally hallucinating unrequested tool calls too (the earlier simulate finding). Worth writing all three up together once confirmed.</w:t>
+      </w:r>
+    </w:p>
+    <w:p/>
+    <w:p>
+      <w:r>
+        <w:t xml:space="preserve">2026-07-19 17:50:15 | INFO | </w:t>
+      </w:r>
+      <w:proofErr w:type="spellStart"/>
+      <w:r>
+        <w:t>supply_chain_delivery_app</w:t>
+      </w:r>
+      <w:proofErr w:type="spellEnd"/>
+      <w:r>
+        <w:t xml:space="preserve"> | </w:t>
+      </w:r>
+      <w:proofErr w:type="spellStart"/>
+      <w:proofErr w:type="gramStart"/>
+      <w:r>
+        <w:t>logger.initialized</w:t>
+      </w:r>
+      <w:proofErr w:type="spellEnd"/>
+      <w:proofErr w:type="gramEnd"/>
+      <w:r>
+        <w:t xml:space="preserve"> path=/Users/aditikulkarni/Documents/Masters/AI-Projects/12-Thesis/0_supply_chain_capstone/sc_delivery_thesis_app/log/delivery_chat_run_20260719_175015.log</w:t>
+      </w:r>
+    </w:p>
+    <w:p/>
+    <w:p>
+      <w:r>
+        <w:t xml:space="preserve">2026-07-19 17:50:15 | INFO | </w:t>
+      </w:r>
+      <w:proofErr w:type="spellStart"/>
+      <w:r>
+        <w:t>supply_chain_delivery_app</w:t>
+      </w:r>
+      <w:proofErr w:type="spellEnd"/>
+      <w:r>
+        <w:t xml:space="preserve"> | </w:t>
+      </w:r>
+      <w:proofErr w:type="spellStart"/>
+      <w:proofErr w:type="gramStart"/>
+      <w:r>
+        <w:t>app.startup</w:t>
+      </w:r>
+      <w:proofErr w:type="spellEnd"/>
+      <w:proofErr w:type="gramEnd"/>
+      <w:r>
+        <w:t xml:space="preserve"> log_path=/Users/aditikulkarni/Documents/Masters/AI-Projects/12-Thesis/0_supply_chain_capstone/sc_delivery_thesis_app/log/delivery_chat_run_20260719_175015.log</w:t>
+      </w:r>
+    </w:p>
+    <w:p/>
+    <w:p>
+      <w:r>
+        <w:t xml:space="preserve">2026-07-19 17:50:21 | INFO | </w:t>
+      </w:r>
+      <w:proofErr w:type="spellStart"/>
+      <w:r>
+        <w:t>supply_chain_delivery_app</w:t>
+      </w:r>
+      <w:proofErr w:type="spellEnd"/>
+      <w:r>
+        <w:t xml:space="preserve"> | </w:t>
+      </w:r>
+      <w:proofErr w:type="spellStart"/>
+      <w:proofErr w:type="gramStart"/>
+      <w:r>
+        <w:t>request.received</w:t>
+      </w:r>
+      <w:proofErr w:type="spellEnd"/>
+      <w:proofErr w:type="gramEnd"/>
+      <w:r>
+        <w:t xml:space="preserve"> </w:t>
+      </w:r>
+      <w:proofErr w:type="spellStart"/>
+      <w:r>
+        <w:t>request_id</w:t>
+      </w:r>
+      <w:proofErr w:type="spellEnd"/>
+      <w:r>
+        <w:t xml:space="preserve">=aa96cdc5596e pending=False </w:t>
+      </w:r>
+      <w:proofErr w:type="spellStart"/>
+      <w:r>
+        <w:t>has_orders_file</w:t>
+      </w:r>
+      <w:proofErr w:type="spellEnd"/>
+      <w:r>
+        <w:t xml:space="preserve">=True </w:t>
+      </w:r>
+      <w:proofErr w:type="spellStart"/>
+      <w:r>
+        <w:t>message_len</w:t>
+      </w:r>
+      <w:proofErr w:type="spellEnd"/>
+      <w:r>
+        <w:t>=237</w:t>
+      </w:r>
+    </w:p>
+    <w:p/>
+    <w:p>
+      <w:r>
+        <w:t xml:space="preserve">2026-07-19 17:50:21 | INFO | </w:t>
+      </w:r>
+      <w:proofErr w:type="spellStart"/>
+      <w:r>
+        <w:t>supply_chain_delivery_app</w:t>
+      </w:r>
+      <w:proofErr w:type="spellEnd"/>
+      <w:r>
+        <w:t xml:space="preserve"> | </w:t>
+      </w:r>
+      <w:proofErr w:type="spellStart"/>
+      <w:proofErr w:type="gramStart"/>
+      <w:r>
+        <w:t>request.confirmation</w:t>
+      </w:r>
+      <w:proofErr w:type="spellEnd"/>
+      <w:proofErr w:type="gramEnd"/>
+      <w:r>
+        <w:t xml:space="preserve"> </w:t>
+      </w:r>
+      <w:proofErr w:type="spellStart"/>
+      <w:r>
+        <w:t>request_id</w:t>
+      </w:r>
+      <w:proofErr w:type="spellEnd"/>
+      <w:r>
+        <w:t>=aa96cdc5596e action=</w:t>
+      </w:r>
+      <w:proofErr w:type="spellStart"/>
+      <w:r>
+        <w:t>run_confirmed</w:t>
+      </w:r>
+      <w:proofErr w:type="spellEnd"/>
+      <w:r>
+        <w:t xml:space="preserve"> </w:t>
+      </w:r>
+      <w:proofErr w:type="spellStart"/>
+      <w:r>
+        <w:t>is_quick_action</w:t>
+      </w:r>
+      <w:proofErr w:type="spellEnd"/>
+      <w:r>
+        <w:t>=True</w:t>
+      </w:r>
+    </w:p>
+    <w:p>
+      <w:r>
+        <w:t xml:space="preserve">2026-07-19 17:50:21 | INFO | </w:t>
+      </w:r>
+      <w:proofErr w:type="spellStart"/>
+      <w:r>
+        <w:t>supply_chain_delivery_app</w:t>
+      </w:r>
+      <w:proofErr w:type="spellEnd"/>
+      <w:r>
+        <w:t xml:space="preserve"> | </w:t>
+      </w:r>
+      <w:proofErr w:type="spellStart"/>
+      <w:proofErr w:type="gramStart"/>
+      <w:r>
+        <w:t>run.started</w:t>
+      </w:r>
+      <w:proofErr w:type="spellEnd"/>
+      <w:proofErr w:type="gramEnd"/>
+      <w:r>
+        <w:t xml:space="preserve"> </w:t>
+      </w:r>
+      <w:proofErr w:type="spellStart"/>
+      <w:r>
+        <w:t>request_id</w:t>
+      </w:r>
+      <w:proofErr w:type="spellEnd"/>
+      <w:r>
+        <w:t xml:space="preserve">=aa96cdc5596e </w:t>
+      </w:r>
+      <w:proofErr w:type="spellStart"/>
+      <w:r>
+        <w:t>query_len</w:t>
+      </w:r>
+      <w:proofErr w:type="spellEnd"/>
+      <w:r>
+        <w:t xml:space="preserve">=883 </w:t>
+      </w:r>
+      <w:proofErr w:type="spellStart"/>
+      <w:r>
+        <w:t>has_orders_file</w:t>
+      </w:r>
+      <w:proofErr w:type="spellEnd"/>
+      <w:r>
+        <w:t>=True</w:t>
+      </w:r>
+    </w:p>
+    <w:p/>
+    <w:p>
+      <w:r>
+        <w:t xml:space="preserve">2026-07-19 17:50:28 | INFO | </w:t>
+      </w:r>
+      <w:proofErr w:type="spellStart"/>
+      <w:r>
+        <w:t>supply_chain_delivery_app</w:t>
+      </w:r>
+      <w:proofErr w:type="spellEnd"/>
+      <w:r>
+        <w:t xml:space="preserve"> | </w:t>
+      </w:r>
+      <w:proofErr w:type="spellStart"/>
+      <w:proofErr w:type="gramStart"/>
+      <w:r>
+        <w:t>tool.call</w:t>
+      </w:r>
+      <w:proofErr w:type="gramEnd"/>
+      <w:r>
+        <w:t>.started</w:t>
+      </w:r>
+      <w:proofErr w:type="spellEnd"/>
+      <w:r>
+        <w:t xml:space="preserve"> </w:t>
+      </w:r>
+      <w:proofErr w:type="spellStart"/>
+      <w:r>
+        <w:t>request_id</w:t>
+      </w:r>
+      <w:proofErr w:type="spellEnd"/>
+      <w:r>
+        <w:t>=aa96cdc5596e tool=</w:t>
+      </w:r>
+      <w:proofErr w:type="spellStart"/>
+      <w:r>
+        <w:t>predict_delivery_delays_tool</w:t>
+      </w:r>
+      <w:proofErr w:type="spellEnd"/>
+      <w:r>
+        <w:t xml:space="preserve"> </w:t>
+      </w:r>
+      <w:proofErr w:type="spellStart"/>
+      <w:r>
+        <w:t>args</w:t>
+      </w:r>
+      <w:proofErr w:type="spellEnd"/>
+      <w:proofErr w:type="gramStart"/>
+      <w:r>
+        <w:t>={</w:t>
+      </w:r>
+      <w:proofErr w:type="gramEnd"/>
+      <w:r>
+        <w:t xml:space="preserve">'request': 'Run delivery delay prediction on the provided daily orders file. Use the input orders data from the </w:t>
+      </w:r>
+      <w:proofErr w:type="spellStart"/>
+      <w:r>
+        <w:t>curr</w:t>
+      </w:r>
+      <w:proofErr w:type="spellEnd"/>
+      <w:r>
+        <w:t>...</w:t>
+      </w:r>
+    </w:p>
+    <w:p/>
+    <w:p>
+      <w:r>
+        <w:t xml:space="preserve">2026-07-19 17:50:28 | INFO | </w:t>
+      </w:r>
+      <w:proofErr w:type="spellStart"/>
+      <w:r>
+        <w:t>supply_chain_delivery_app</w:t>
+      </w:r>
+      <w:proofErr w:type="spellEnd"/>
+      <w:r>
+        <w:t xml:space="preserve"> | </w:t>
+      </w:r>
+      <w:proofErr w:type="spellStart"/>
+      <w:proofErr w:type="gramStart"/>
+      <w:r>
+        <w:t>tool.call</w:t>
+      </w:r>
+      <w:proofErr w:type="gramEnd"/>
+      <w:r>
+        <w:t>.completed</w:t>
+      </w:r>
+      <w:proofErr w:type="spellEnd"/>
+      <w:r>
+        <w:t xml:space="preserve"> </w:t>
+      </w:r>
+      <w:proofErr w:type="spellStart"/>
+      <w:r>
+        <w:t>request_id</w:t>
+      </w:r>
+      <w:proofErr w:type="spellEnd"/>
+      <w:r>
+        <w:t>=aa96cdc5596e tool=</w:t>
+      </w:r>
+      <w:proofErr w:type="spellStart"/>
+      <w:r>
+        <w:t>predict_delivery_delays_tool</w:t>
+      </w:r>
+      <w:proofErr w:type="spellEnd"/>
+      <w:r>
+        <w:t xml:space="preserve"> </w:t>
+      </w:r>
+      <w:proofErr w:type="spellStart"/>
+      <w:r>
+        <w:t>duration_ms</w:t>
+      </w:r>
+      <w:proofErr w:type="spellEnd"/>
+      <w:r>
+        <w:t>=2974</w:t>
+      </w:r>
+    </w:p>
+    <w:p>
+      <w:r>
+        <w:t xml:space="preserve">2026-07-19 17:50:28 | INFO | </w:t>
+      </w:r>
+      <w:proofErr w:type="spellStart"/>
+      <w:r>
+        <w:t>supply_chain_delivery_app</w:t>
+      </w:r>
+      <w:proofErr w:type="spellEnd"/>
+      <w:r>
+        <w:t xml:space="preserve"> | </w:t>
+      </w:r>
+      <w:proofErr w:type="spellStart"/>
+      <w:proofErr w:type="gramStart"/>
+      <w:r>
+        <w:t>predict.rows</w:t>
+      </w:r>
+      <w:proofErr w:type="spellEnd"/>
+      <w:proofErr w:type="gramEnd"/>
+      <w:r>
+        <w:t xml:space="preserve"> </w:t>
+      </w:r>
+      <w:proofErr w:type="spellStart"/>
+      <w:r>
+        <w:t>request_id</w:t>
+      </w:r>
+      <w:proofErr w:type="spellEnd"/>
+      <w:r>
+        <w:t>=aa96cdc5596e source=</w:t>
+      </w:r>
+      <w:proofErr w:type="spellStart"/>
+      <w:r>
+        <w:t>tool_stream</w:t>
+      </w:r>
+      <w:proofErr w:type="spellEnd"/>
+      <w:r>
+        <w:t xml:space="preserve"> count=0</w:t>
+      </w:r>
+    </w:p>
+    <w:p/>
+    <w:p>
+      <w:r>
+        <w:t xml:space="preserve">2026-07-19 17:50:29 | INFO | </w:t>
+      </w:r>
+      <w:proofErr w:type="spellStart"/>
+      <w:r>
+        <w:t>supply_chain_delivery_app</w:t>
+      </w:r>
+      <w:proofErr w:type="spellEnd"/>
+      <w:r>
+        <w:t xml:space="preserve"> | </w:t>
+      </w:r>
+      <w:proofErr w:type="spellStart"/>
+      <w:proofErr w:type="gramStart"/>
+      <w:r>
+        <w:t>run.outputs</w:t>
+      </w:r>
+      <w:proofErr w:type="spellEnd"/>
+      <w:proofErr w:type="gramEnd"/>
+      <w:r>
+        <w:t xml:space="preserve"> </w:t>
+      </w:r>
+      <w:proofErr w:type="spellStart"/>
+      <w:r>
+        <w:t>request_id</w:t>
+      </w:r>
+      <w:proofErr w:type="spellEnd"/>
+      <w:r>
+        <w:t>=aa96cdc5596e predict=True diagnosis=False simulate=False recommend=False email=False</w:t>
+      </w:r>
+    </w:p>
+    <w:p/>
+    <w:p>
+      <w:r>
+        <w:t xml:space="preserve">2026-07-19 17:50:29 | INFO | </w:t>
+      </w:r>
+      <w:proofErr w:type="spellStart"/>
+      <w:r>
+        <w:t>supply_chain_delivery_app</w:t>
+      </w:r>
+      <w:proofErr w:type="spellEnd"/>
+      <w:r>
+        <w:t xml:space="preserve"> | </w:t>
+      </w:r>
+      <w:proofErr w:type="spellStart"/>
+      <w:proofErr w:type="gramStart"/>
+      <w:r>
+        <w:t>debug.agent</w:t>
+      </w:r>
+      <w:proofErr w:type="gramEnd"/>
+      <w:r>
+        <w:t>_text</w:t>
+      </w:r>
+      <w:proofErr w:type="spellEnd"/>
+      <w:r>
+        <w:t xml:space="preserve"> </w:t>
+      </w:r>
+      <w:proofErr w:type="spellStart"/>
+      <w:r>
+        <w:t>request_id</w:t>
+      </w:r>
+      <w:proofErr w:type="spellEnd"/>
+      <w:r>
+        <w:t xml:space="preserve">=aa96cdc5596e agent=predict </w:t>
+      </w:r>
+      <w:proofErr w:type="spellStart"/>
+      <w:r>
+        <w:t>is_real</w:t>
+      </w:r>
+      <w:proofErr w:type="spellEnd"/>
+      <w:r>
+        <w:t>=True preview='### Cross-Dimensional Delay Insights\n\</w:t>
+      </w:r>
+      <w:proofErr w:type="spellStart"/>
+      <w:r>
+        <w:t>nUnable</w:t>
+      </w:r>
+      <w:proofErr w:type="spellEnd"/>
+      <w:r>
+        <w:t xml:space="preserve"> to complete prediction because the delivery delay pipeline failed to run on the provided file path. Please verify the input CSV path and try </w:t>
+      </w:r>
+      <w:proofErr w:type="gramStart"/>
+      <w:r>
+        <w:t>again.\n\n</w:t>
+      </w:r>
+      <w:proofErr w:type="gramEnd"/>
+      <w:r>
+        <w:t>### De'</w:t>
+      </w:r>
+    </w:p>
+    <w:p/>
+    <w:p>
+      <w:r>
+        <w:t xml:space="preserve">2026-07-19 17:50:29 | INFO | </w:t>
+      </w:r>
+      <w:proofErr w:type="spellStart"/>
+      <w:r>
+        <w:t>supply_chain_delivery_app</w:t>
+      </w:r>
+      <w:proofErr w:type="spellEnd"/>
+      <w:r>
+        <w:t xml:space="preserve"> | </w:t>
+      </w:r>
+      <w:proofErr w:type="spellStart"/>
+      <w:proofErr w:type="gramStart"/>
+      <w:r>
+        <w:t>debug.agent</w:t>
+      </w:r>
+      <w:proofErr w:type="gramEnd"/>
+      <w:r>
+        <w:t>_text</w:t>
+      </w:r>
+      <w:proofErr w:type="spellEnd"/>
+      <w:r>
+        <w:t xml:space="preserve"> </w:t>
+      </w:r>
+      <w:proofErr w:type="spellStart"/>
+      <w:r>
+        <w:t>request_id</w:t>
+      </w:r>
+      <w:proofErr w:type="spellEnd"/>
+      <w:r>
+        <w:t xml:space="preserve">=aa96cdc5596e agent=simulate </w:t>
+      </w:r>
+      <w:proofErr w:type="spellStart"/>
+      <w:r>
+        <w:t>is_real</w:t>
+      </w:r>
+      <w:proofErr w:type="spellEnd"/>
+      <w:r>
+        <w:t>=False preview=''</w:t>
+      </w:r>
+    </w:p>
+    <w:p/>
+    <w:p>
+      <w:r>
+        <w:t xml:space="preserve">2026-07-19 17:50:29 | INFO | </w:t>
+      </w:r>
+      <w:proofErr w:type="spellStart"/>
+      <w:r>
+        <w:t>supply_chain_delivery_app</w:t>
+      </w:r>
+      <w:proofErr w:type="spellEnd"/>
+      <w:r>
+        <w:t xml:space="preserve"> | </w:t>
+      </w:r>
+      <w:proofErr w:type="spellStart"/>
+      <w:proofErr w:type="gramStart"/>
+      <w:r>
+        <w:t>debug.agent</w:t>
+      </w:r>
+      <w:proofErr w:type="gramEnd"/>
+      <w:r>
+        <w:t>_text</w:t>
+      </w:r>
+      <w:proofErr w:type="spellEnd"/>
+      <w:r>
+        <w:t xml:space="preserve"> </w:t>
+      </w:r>
+      <w:proofErr w:type="spellStart"/>
+      <w:r>
+        <w:t>request_id</w:t>
+      </w:r>
+      <w:proofErr w:type="spellEnd"/>
+      <w:r>
+        <w:t xml:space="preserve">=aa96cdc5596e agent=diagnosis </w:t>
+      </w:r>
+      <w:proofErr w:type="spellStart"/>
+      <w:r>
+        <w:t>is_real</w:t>
+      </w:r>
+      <w:proofErr w:type="spellEnd"/>
+      <w:r>
+        <w:t>=False preview=''</w:t>
+      </w:r>
+    </w:p>
+    <w:p/>
+    <w:p>
+      <w:r>
+        <w:t xml:space="preserve">2026-07-19 17:50:29 | INFO | </w:t>
+      </w:r>
+      <w:proofErr w:type="spellStart"/>
+      <w:r>
+        <w:t>supply_chain_delivery_app</w:t>
+      </w:r>
+      <w:proofErr w:type="spellEnd"/>
+      <w:r>
+        <w:t xml:space="preserve"> | </w:t>
+      </w:r>
+      <w:proofErr w:type="spellStart"/>
+      <w:proofErr w:type="gramStart"/>
+      <w:r>
+        <w:t>debug.agent</w:t>
+      </w:r>
+      <w:proofErr w:type="gramEnd"/>
+      <w:r>
+        <w:t>_text</w:t>
+      </w:r>
+      <w:proofErr w:type="spellEnd"/>
+      <w:r>
+        <w:t xml:space="preserve"> </w:t>
+      </w:r>
+      <w:proofErr w:type="spellStart"/>
+      <w:r>
+        <w:t>request_id</w:t>
+      </w:r>
+      <w:proofErr w:type="spellEnd"/>
+      <w:r>
+        <w:t xml:space="preserve">=aa96cdc5596e agent=recommend </w:t>
+      </w:r>
+      <w:proofErr w:type="spellStart"/>
+      <w:r>
+        <w:t>is_real</w:t>
+      </w:r>
+      <w:proofErr w:type="spellEnd"/>
+      <w:r>
+        <w:t>=False preview=''</w:t>
+      </w:r>
+    </w:p>
+    <w:p/>
+    <w:p>
+      <w:r>
+        <w:t xml:space="preserve">2026-07-19 17:50:29 | INFO | </w:t>
+      </w:r>
+      <w:proofErr w:type="spellStart"/>
+      <w:r>
+        <w:t>supply_chain_delivery_app</w:t>
+      </w:r>
+      <w:proofErr w:type="spellEnd"/>
+      <w:r>
+        <w:t xml:space="preserve"> | </w:t>
+      </w:r>
+      <w:proofErr w:type="spellStart"/>
+      <w:proofErr w:type="gramStart"/>
+      <w:r>
+        <w:t>debug.agent</w:t>
+      </w:r>
+      <w:proofErr w:type="gramEnd"/>
+      <w:r>
+        <w:t>_text</w:t>
+      </w:r>
+      <w:proofErr w:type="spellEnd"/>
+      <w:r>
+        <w:t xml:space="preserve"> </w:t>
+      </w:r>
+      <w:proofErr w:type="spellStart"/>
+      <w:r>
+        <w:t>request_id</w:t>
+      </w:r>
+      <w:proofErr w:type="spellEnd"/>
+      <w:r>
+        <w:t xml:space="preserve">=aa96cdc5596e agent=email </w:t>
+      </w:r>
+      <w:proofErr w:type="spellStart"/>
+      <w:r>
+        <w:t>is_real</w:t>
+      </w:r>
+      <w:proofErr w:type="spellEnd"/>
+      <w:r>
+        <w:t>=False preview=''</w:t>
+      </w:r>
+    </w:p>
+    <w:p>
+      <w:r>
+        <w:t xml:space="preserve">2026-07-19 17:50:29 | INFO | </w:t>
+      </w:r>
+      <w:proofErr w:type="spellStart"/>
+      <w:r>
+        <w:t>supply_chain_delivery_app</w:t>
+      </w:r>
+      <w:proofErr w:type="spellEnd"/>
+      <w:r>
+        <w:t xml:space="preserve"> | </w:t>
+      </w:r>
+      <w:proofErr w:type="spellStart"/>
+      <w:proofErr w:type="gramStart"/>
+      <w:r>
+        <w:t>run.completed</w:t>
+      </w:r>
+      <w:proofErr w:type="spellEnd"/>
+      <w:proofErr w:type="gramEnd"/>
+      <w:r>
+        <w:t xml:space="preserve"> </w:t>
+      </w:r>
+      <w:proofErr w:type="spellStart"/>
+      <w:r>
+        <w:t>request_id</w:t>
+      </w:r>
+      <w:proofErr w:type="spellEnd"/>
+      <w:r>
+        <w:t xml:space="preserve">=aa96cdc5596e </w:t>
+      </w:r>
+      <w:proofErr w:type="spellStart"/>
+      <w:r>
+        <w:t>duration_ms</w:t>
+      </w:r>
+      <w:proofErr w:type="spellEnd"/>
+      <w:r>
+        <w:t>=7911</w:t>
+      </w:r>
+    </w:p>
+    <w:p/>
+    <w:p>
+      <w:r>
+        <w:lastRenderedPageBreak/>
+        <w:t xml:space="preserve">2026-07-19 17:50:29 | INFO | </w:t>
+      </w:r>
+      <w:proofErr w:type="spellStart"/>
+      <w:r>
+        <w:t>supply_chain_delivery_app</w:t>
+      </w:r>
+      <w:proofErr w:type="spellEnd"/>
+      <w:r>
+        <w:t xml:space="preserve"> | </w:t>
+      </w:r>
+      <w:proofErr w:type="spellStart"/>
+      <w:proofErr w:type="gramStart"/>
+      <w:r>
+        <w:t>run.usage</w:t>
+      </w:r>
+      <w:proofErr w:type="gramEnd"/>
+      <w:r>
+        <w:t>.summary</w:t>
+      </w:r>
+      <w:proofErr w:type="spellEnd"/>
+      <w:r>
+        <w:t xml:space="preserve"> </w:t>
+      </w:r>
+      <w:proofErr w:type="spellStart"/>
+      <w:r>
+        <w:t>request_id</w:t>
+      </w:r>
+      <w:proofErr w:type="spellEnd"/>
+      <w:r>
+        <w:t xml:space="preserve">=aa96cdc5596e </w:t>
+      </w:r>
+      <w:proofErr w:type="spellStart"/>
+      <w:r>
+        <w:t>master_prompt</w:t>
+      </w:r>
+      <w:proofErr w:type="spellEnd"/>
+      <w:r>
+        <w:t xml:space="preserve">=10357 </w:t>
+      </w:r>
+      <w:proofErr w:type="spellStart"/>
+      <w:r>
+        <w:t>master_completion</w:t>
+      </w:r>
+      <w:proofErr w:type="spellEnd"/>
+      <w:r>
+        <w:t xml:space="preserve">=105 </w:t>
+      </w:r>
+      <w:proofErr w:type="spellStart"/>
+      <w:r>
+        <w:t>master_total</w:t>
+      </w:r>
+      <w:proofErr w:type="spellEnd"/>
+      <w:r>
+        <w:t xml:space="preserve">=10462 </w:t>
+      </w:r>
+      <w:proofErr w:type="spellStart"/>
+      <w:r>
+        <w:t>subagent_prompt</w:t>
+      </w:r>
+      <w:proofErr w:type="spellEnd"/>
+      <w:r>
+        <w:t xml:space="preserve">=7312 </w:t>
+      </w:r>
+      <w:proofErr w:type="spellStart"/>
+      <w:r>
+        <w:t>subagent_completion</w:t>
+      </w:r>
+      <w:proofErr w:type="spellEnd"/>
+      <w:r>
+        <w:t xml:space="preserve">=81 </w:t>
+      </w:r>
+      <w:proofErr w:type="spellStart"/>
+      <w:r>
+        <w:t>subagent_total</w:t>
+      </w:r>
+      <w:proofErr w:type="spellEnd"/>
+      <w:r>
+        <w:t xml:space="preserve">=7393 </w:t>
+      </w:r>
+      <w:proofErr w:type="spellStart"/>
+      <w:r>
+        <w:t>grand_prompt</w:t>
+      </w:r>
+      <w:proofErr w:type="spellEnd"/>
+      <w:r>
+        <w:t xml:space="preserve">=17669 </w:t>
+      </w:r>
+      <w:proofErr w:type="spellStart"/>
+      <w:r>
+        <w:t>grand_completion</w:t>
+      </w:r>
+      <w:proofErr w:type="spellEnd"/>
+      <w:r>
+        <w:t xml:space="preserve">=186 </w:t>
+      </w:r>
+      <w:proofErr w:type="spellStart"/>
+      <w:r>
+        <w:t>grand_total</w:t>
+      </w:r>
+      <w:proofErr w:type="spellEnd"/>
+      <w:r>
+        <w:t>=17855</w:t>
+      </w:r>
+    </w:p>
+    <w:p/>
+    <w:p>
+      <w:r>
+        <w:t xml:space="preserve">2026-07-19 17:50:29 | INFO | </w:t>
+      </w:r>
+      <w:proofErr w:type="spellStart"/>
+      <w:r>
+        <w:t>supply_chain_delivery_app</w:t>
+      </w:r>
+      <w:proofErr w:type="spellEnd"/>
+      <w:r>
+        <w:t xml:space="preserve"> | </w:t>
+      </w:r>
+      <w:proofErr w:type="spellStart"/>
+      <w:proofErr w:type="gramStart"/>
+      <w:r>
+        <w:t>run.usage</w:t>
+      </w:r>
+      <w:proofErr w:type="gramEnd"/>
+      <w:r>
+        <w:t>.subagent</w:t>
+      </w:r>
+      <w:proofErr w:type="spellEnd"/>
+      <w:r>
+        <w:t xml:space="preserve"> </w:t>
+      </w:r>
+      <w:proofErr w:type="spellStart"/>
+      <w:r>
+        <w:t>request_id</w:t>
+      </w:r>
+      <w:proofErr w:type="spellEnd"/>
+      <w:r>
+        <w:t>=aa96cdc5596e tool=</w:t>
+      </w:r>
+      <w:proofErr w:type="spellStart"/>
+      <w:r>
+        <w:t>predict_delivery_delays_tool</w:t>
+      </w:r>
+      <w:proofErr w:type="spellEnd"/>
+      <w:r>
+        <w:t xml:space="preserve"> prompt=7312 completion=81 total=7393</w:t>
+      </w:r>
+    </w:p>
+    <w:p/>
+    <w:p>
+      <w:r>
+        <w:t xml:space="preserve">2026-07-19 17:50:29 | INFO | </w:t>
+      </w:r>
+      <w:proofErr w:type="spellStart"/>
+      <w:r>
+        <w:t>supply_chain_delivery_app</w:t>
+      </w:r>
+      <w:proofErr w:type="spellEnd"/>
+      <w:r>
+        <w:t xml:space="preserve"> | </w:t>
+      </w:r>
+      <w:proofErr w:type="spellStart"/>
+      <w:proofErr w:type="gramStart"/>
+      <w:r>
+        <w:t>run.timing</w:t>
+      </w:r>
+      <w:proofErr w:type="gramEnd"/>
+      <w:r>
+        <w:t>.summary</w:t>
+      </w:r>
+      <w:proofErr w:type="spellEnd"/>
+      <w:r>
+        <w:t xml:space="preserve"> </w:t>
+      </w:r>
+      <w:proofErr w:type="spellStart"/>
+      <w:r>
+        <w:t>request_id</w:t>
+      </w:r>
+      <w:proofErr w:type="spellEnd"/>
+      <w:r>
+        <w:t xml:space="preserve">=aa96cdc5596e </w:t>
+      </w:r>
+      <w:proofErr w:type="spellStart"/>
+      <w:r>
+        <w:t>tool_time_s</w:t>
+      </w:r>
+      <w:proofErr w:type="spellEnd"/>
+      <w:r>
+        <w:t xml:space="preserve">=2.97 </w:t>
+      </w:r>
+      <w:proofErr w:type="spellStart"/>
+      <w:r>
+        <w:t>master_time_approx_s</w:t>
+      </w:r>
+      <w:proofErr w:type="spellEnd"/>
+      <w:r>
+        <w:t xml:space="preserve">=4.94 </w:t>
+      </w:r>
+      <w:proofErr w:type="spellStart"/>
+      <w:r>
+        <w:t>wall_time_s</w:t>
+      </w:r>
+      <w:proofErr w:type="spellEnd"/>
+      <w:r>
+        <w:t>=7.91</w:t>
+      </w:r>
+    </w:p>
+    <w:p/>
+    <w:p>
+      <w:r>
+        <w:t xml:space="preserve">2026-07-19 17:50:29 | INFO | </w:t>
+      </w:r>
+      <w:proofErr w:type="spellStart"/>
+      <w:r>
+        <w:t>supply_chain_delivery_app</w:t>
+      </w:r>
+      <w:proofErr w:type="spellEnd"/>
+      <w:r>
+        <w:t xml:space="preserve"> | </w:t>
+      </w:r>
+      <w:proofErr w:type="spellStart"/>
+      <w:proofErr w:type="gramStart"/>
+      <w:r>
+        <w:t>run.response</w:t>
+      </w:r>
+      <w:proofErr w:type="gramEnd"/>
+      <w:r>
+        <w:t>_cache_stored</w:t>
+      </w:r>
+      <w:proofErr w:type="spellEnd"/>
+      <w:r>
+        <w:t xml:space="preserve"> </w:t>
+      </w:r>
+      <w:proofErr w:type="spellStart"/>
+      <w:r>
+        <w:t>request_id</w:t>
+      </w:r>
+      <w:proofErr w:type="spellEnd"/>
+      <w:r>
+        <w:t>=aa96cdc5596e keys</w:t>
+      </w:r>
+      <w:proofErr w:type="gramStart"/>
+      <w:r>
+        <w:t>=[</w:t>
+      </w:r>
+      <w:proofErr w:type="gramEnd"/>
+      <w:r>
+        <w:t>'</w:t>
+      </w:r>
+      <w:proofErr w:type="spellStart"/>
+      <w:r>
+        <w:t>predict_csv</w:t>
+      </w:r>
+      <w:proofErr w:type="spellEnd"/>
+      <w:r>
+        <w:t>', '</w:t>
+      </w:r>
+      <w:proofErr w:type="spellStart"/>
+      <w:r>
+        <w:t>predict_df</w:t>
+      </w:r>
+      <w:proofErr w:type="spellEnd"/>
+      <w:r>
+        <w:t>', '</w:t>
+      </w:r>
+      <w:proofErr w:type="spellStart"/>
+      <w:r>
+        <w:t>predict_md</w:t>
+      </w:r>
+      <w:proofErr w:type="spellEnd"/>
+      <w:r>
+        <w:t>']</w:t>
+      </w:r>
+    </w:p>
+    <w:p/>
+    <w:p>
+      <w:r>
+        <w:t>That log changes the diagnosis completely — this isn't a model-reasoning/attention issue at all, it's a concrete regression.</w:t>
+      </w:r>
+    </w:p>
+    <w:p>
+      <w:proofErr w:type="spellStart"/>
+      <w:proofErr w:type="gramStart"/>
+      <w:r>
+        <w:t>predict.rows</w:t>
+      </w:r>
+      <w:proofErr w:type="spellEnd"/>
+      <w:proofErr w:type="gramEnd"/>
+      <w:r>
+        <w:t xml:space="preserve"> source=</w:t>
+      </w:r>
+      <w:proofErr w:type="spellStart"/>
+      <w:r>
+        <w:t>tool_stream</w:t>
+      </w:r>
+      <w:proofErr w:type="spellEnd"/>
+      <w:r>
+        <w:t xml:space="preserve"> count=0 and the summary text itself say it plainly: </w:t>
+      </w:r>
+      <w:r>
+        <w:rPr>
+          <w:i/>
+          <w:iCs/>
+        </w:rPr>
+        <w:t>"Unable to complete prediction because the delivery delay pipeline failed to run on the provided file path."</w:t>
+      </w:r>
+      <w:r>
+        <w:t xml:space="preserve"> And critically — there's no [Pipeline] </w:t>
+      </w:r>
+      <w:proofErr w:type="spellStart"/>
+      <w:r>
+        <w:t>build_mcp_response</w:t>
+      </w:r>
+      <w:proofErr w:type="spellEnd"/>
+      <w:r>
+        <w:t xml:space="preserve"> line anywhere in this log, unlike your earlier successful runs. The underlying ML pipeline never even started; it failed on the file path before doing any real work. That's why diagnosis/simulate/recommend/email never ran — not because the master lost track of the plan, but because master_expert.md Section 1 explicitly says: </w:t>
+      </w:r>
+      <w:r>
+        <w:rPr>
+          <w:i/>
+          <w:iCs/>
+        </w:rPr>
+        <w:t>"If any tool returns a JSON with an error... do NOT call further tools... do not attempt to proceed with downstream tools."</w:t>
+      </w:r>
+      <w:r>
+        <w:t xml:space="preserve"> The master followed that rule correctly. My earlier "when in doubt, call it" / degraded long-context planning theory was a reasonable guess given what I had, but it's not what happened here — retracting it.</w:t>
+      </w:r>
+    </w:p>
+    <w:p>
+      <w:r>
+        <w:t xml:space="preserve">The real cause: the master </w:t>
+      </w:r>
+      <w:proofErr w:type="gramStart"/>
+      <w:r>
+        <w:t>has to</w:t>
+      </w:r>
+      <w:proofErr w:type="gramEnd"/>
+      <w:r>
+        <w:t xml:space="preserve"> relay the literal absolute file path (which the user's query does state explicitly — </w:t>
+      </w:r>
+      <w:proofErr w:type="spellStart"/>
+      <w:r>
+        <w:t>full_query</w:t>
+      </w:r>
+      <w:proofErr w:type="spellEnd"/>
+      <w:r>
+        <w:t xml:space="preserve"> in delivery_chat_app.py includes "The input orders data is in the file at path: {</w:t>
+      </w:r>
+      <w:proofErr w:type="spellStart"/>
+      <w:r>
+        <w:t>orders_path</w:t>
+      </w:r>
+      <w:proofErr w:type="spellEnd"/>
+      <w:r>
+        <w:t xml:space="preserve">}") into the request string it hands to </w:t>
+      </w:r>
+      <w:proofErr w:type="spellStart"/>
+      <w:r>
+        <w:t>predict_delivery_delays_tool</w:t>
+      </w:r>
+      <w:proofErr w:type="spellEnd"/>
+      <w:r>
+        <w:t xml:space="preserve">. That relay step used to be reinforced by an explicit docstring on the tool wrapper — recall the earlier fix in this project's history: </w:t>
+      </w:r>
+      <w:r>
+        <w:rPr>
+          <w:i/>
+          <w:iCs/>
+        </w:rPr>
+        <w:t>"Model hallucinating file paths... fixed by adding an explicit docstring to the tool wrapper function."</w:t>
+      </w:r>
+      <w:r>
+        <w:t xml:space="preserve"> Checking topologies/</w:t>
+      </w:r>
+      <w:proofErr w:type="spellStart"/>
+      <w:r>
+        <w:t>planner_executor.py's</w:t>
+      </w:r>
+      <w:proofErr w:type="spellEnd"/>
+      <w:r>
+        <w:t xml:space="preserve"> current _</w:t>
+      </w:r>
+      <w:proofErr w:type="spellStart"/>
+      <w:r>
+        <w:t>run_sub_agent</w:t>
+      </w:r>
+      <w:proofErr w:type="spellEnd"/>
+      <w:r>
+        <w:t>:</w:t>
+      </w:r>
+    </w:p>
+    <w:p/>
+    <w:p>
+      <w:r>
+        <w:t>async def _</w:t>
+      </w:r>
+      <w:proofErr w:type="spellStart"/>
+      <w:r>
+        <w:t>run_sub_</w:t>
+      </w:r>
+      <w:proofErr w:type="gramStart"/>
+      <w:r>
+        <w:t>agent</w:t>
+      </w:r>
+      <w:proofErr w:type="spellEnd"/>
+      <w:r>
+        <w:t>(</w:t>
+      </w:r>
+      <w:proofErr w:type="gramEnd"/>
+      <w:r>
+        <w:t xml:space="preserve">request: str) -&gt; str: result = await </w:t>
+      </w:r>
+      <w:proofErr w:type="spellStart"/>
+      <w:r>
+        <w:t>agent.run</w:t>
+      </w:r>
+      <w:proofErr w:type="spellEnd"/>
+      <w:r>
+        <w:t>(request) ...</w:t>
+      </w:r>
+    </w:p>
+    <w:p/>
+    <w:p>
+      <w:r>
+        <w:t>No docstring at all. That reminder didn't survive the modularization into topologies/planner_executor.py — it's a genuine regression, not a tier-specific finding. It explains the intermittency too: your run_once.py test with gpt-5.4-mini succeeded (pipeline ran, real data came back), while this UI run with the same model failed — a coin-flip outcome is exactly what you'd expect once the explicit safeguard is missing, regardless of tier.</w:t>
+      </w:r>
+    </w:p>
+    <w:p>
+      <w:r>
+        <w:t>Fix — restore the docstring:</w:t>
+      </w:r>
+    </w:p>
+    <w:p/>
+    <w:p>
+      <w:r>
+        <w:t>@</w:t>
+      </w:r>
+      <w:proofErr w:type="gramStart"/>
+      <w:r>
+        <w:t>tool(</w:t>
+      </w:r>
+      <w:proofErr w:type="gramEnd"/>
+      <w:r>
+        <w:t>name=tool_name, description=</w:t>
+      </w:r>
+      <w:proofErr w:type="spellStart"/>
+      <w:r>
+        <w:t>tool_description</w:t>
+      </w:r>
+      <w:proofErr w:type="spellEnd"/>
+      <w:r>
+        <w:t>)</w:t>
+      </w:r>
+    </w:p>
+    <w:p>
+      <w:r>
+        <w:t>async def _</w:t>
+      </w:r>
+      <w:proofErr w:type="spellStart"/>
+      <w:r>
+        <w:t>run_sub_</w:t>
+      </w:r>
+      <w:proofErr w:type="gramStart"/>
+      <w:r>
+        <w:t>agent</w:t>
+      </w:r>
+      <w:proofErr w:type="spellEnd"/>
+      <w:r>
+        <w:t>(</w:t>
+      </w:r>
+      <w:proofErr w:type="gramEnd"/>
+      <w:r>
+        <w:t>request: str) -&gt; str:</w:t>
+      </w:r>
+    </w:p>
+    <w:p>
+      <w:r>
+        <w:t xml:space="preserve">    """request: the full task for this specialist, INCLUDING any file paths from the user's message verbatim."""</w:t>
+      </w:r>
+    </w:p>
+    <w:p>
+      <w:r>
+        <w:t xml:space="preserve">    result = await </w:t>
+      </w:r>
+      <w:proofErr w:type="spellStart"/>
+      <w:r>
+        <w:t>agent.run</w:t>
+      </w:r>
+      <w:proofErr w:type="spellEnd"/>
+      <w:r>
+        <w:t>(request)</w:t>
+      </w:r>
+    </w:p>
+    <w:p>
+      <w:r>
+        <w:t xml:space="preserve">    </w:t>
+      </w:r>
+      <w:proofErr w:type="spellStart"/>
+      <w:r>
+        <w:t>record_sub_agent_</w:t>
+      </w:r>
+      <w:proofErr w:type="gramStart"/>
+      <w:r>
+        <w:t>usage</w:t>
+      </w:r>
+      <w:proofErr w:type="spellEnd"/>
+      <w:r>
+        <w:t>(</w:t>
+      </w:r>
+      <w:proofErr w:type="spellStart"/>
+      <w:proofErr w:type="gramEnd"/>
+      <w:r>
+        <w:t>tool_name</w:t>
+      </w:r>
+      <w:proofErr w:type="spellEnd"/>
+      <w:r>
+        <w:t>, result)</w:t>
+      </w:r>
+    </w:p>
+    <w:p>
+      <w:r>
+        <w:t xml:space="preserve">    if </w:t>
+      </w:r>
+      <w:proofErr w:type="spellStart"/>
+      <w:proofErr w:type="gramStart"/>
+      <w:r>
+        <w:t>isinstance</w:t>
+      </w:r>
+      <w:proofErr w:type="spellEnd"/>
+      <w:r>
+        <w:t>(</w:t>
+      </w:r>
+      <w:proofErr w:type="spellStart"/>
+      <w:proofErr w:type="gramEnd"/>
+      <w:r>
+        <w:t>result.value</w:t>
+      </w:r>
+      <w:proofErr w:type="spellEnd"/>
+      <w:r>
+        <w:t xml:space="preserve">, </w:t>
+      </w:r>
+      <w:proofErr w:type="spellStart"/>
+      <w:r>
+        <w:t>BaseModel</w:t>
+      </w:r>
+      <w:proofErr w:type="spellEnd"/>
+      <w:r>
+        <w:t>):</w:t>
+      </w:r>
+    </w:p>
+    <w:p>
+      <w:r>
+        <w:t xml:space="preserve">        return </w:t>
+      </w:r>
+      <w:proofErr w:type="spellStart"/>
+      <w:r>
+        <w:t>result.</w:t>
+      </w:r>
+      <w:proofErr w:type="gramStart"/>
+      <w:r>
+        <w:t>value.model</w:t>
+      </w:r>
+      <w:proofErr w:type="gramEnd"/>
+      <w:r>
+        <w:t>_dump_</w:t>
+      </w:r>
+      <w:proofErr w:type="gramStart"/>
+      <w:r>
+        <w:t>json</w:t>
+      </w:r>
+      <w:proofErr w:type="spellEnd"/>
+      <w:r>
+        <w:t>(</w:t>
+      </w:r>
+      <w:proofErr w:type="gramEnd"/>
+      <w:r>
+        <w:t>)</w:t>
+      </w:r>
+    </w:p>
+    <w:p>
+      <w:r>
+        <w:t xml:space="preserve">    return str(</w:t>
+      </w:r>
+      <w:proofErr w:type="spellStart"/>
+      <w:r>
+        <w:t>result.value</w:t>
+      </w:r>
+      <w:proofErr w:type="spellEnd"/>
+      <w:r>
+        <w:t>)</w:t>
+      </w:r>
+    </w:p>
+    <w:p/>
+    <w:p>
+      <w:r>
+        <w:t xml:space="preserve">Confirmed — </w:t>
+      </w:r>
+      <w:proofErr w:type="spellStart"/>
+      <w:r>
+        <w:t>predict's</w:t>
+      </w:r>
+      <w:proofErr w:type="spellEnd"/>
+      <w:r>
+        <w:t xml:space="preserve"> own prompt file has zero mentions of "error" or "fail" anywhere. There's no instruction </w:t>
+      </w:r>
+      <w:proofErr w:type="gramStart"/>
+      <w:r>
+        <w:t>telling</w:t>
+      </w:r>
+      <w:proofErr w:type="gramEnd"/>
+      <w:r>
+        <w:t xml:space="preserve"> that sub-agent what to do if its own tool call fails, so it improvised: reported a failure sentence, then kept going and wrote a full fake results section with specific numbers. That's the real root cause, and it's a different (and more serious) problem than the UI display bug — it's the sub-agent itself fabricating data after acknowledging failure, not just the UI mishandling a legitimate error string. Let me check whether the other four have the same gap.</w:t>
+      </w:r>
+    </w:p>
+    <w:p/>
+    <w:p>
+      <w:r>
+        <w:lastRenderedPageBreak/>
+        <w:drawing>
+          <wp:inline distT="0" distB="0" distL="0" distR="0" wp14:anchorId="14DB35B7" wp14:editId="7D82D216">
+            <wp:extent cx="5943600" cy="3539490"/>
+            <wp:effectExtent l="0" t="0" r="0" b="3810"/>
+            <wp:docPr id="591156579" name="Picture 1" descr="A screenshot of a computer program&#10;&#10;AI-generated content may be incorrect."/>
+            <wp:cNvGraphicFramePr>
+              <a:graphicFrameLocks xmlns:a="http://schemas.openxmlformats.org/drawingml/2006/main" noChangeAspect="1"/>
+            </wp:cNvGraphicFramePr>
+            <a:graphic xmlns:a="http://schemas.openxmlformats.org/drawingml/2006/main">
+              <a:graphicData uri="http://schemas.openxmlformats.org/drawingml/2006/picture">
+                <pic:pic xmlns:pic="http://schemas.openxmlformats.org/drawingml/2006/picture">
+                  <pic:nvPicPr>
+                    <pic:cNvPr id="591156579" name="Picture 1" descr="A screenshot of a computer program&#10;&#10;AI-generated content may be incorrect."/>
+                    <pic:cNvPicPr/>
+                  </pic:nvPicPr>
+                  <pic:blipFill>
+                    <a:blip r:embed="rId17"/>
+                    <a:stretch>
+                      <a:fillRect/>
+                    </a:stretch>
+                  </pic:blipFill>
+                  <pic:spPr>
+                    <a:xfrm>
+                      <a:off x="0" y="0"/>
+                      <a:ext cx="5943600" cy="3539490"/>
+                    </a:xfrm>
+                    <a:prstGeom prst="rect">
+                      <a:avLst/>
+                    </a:prstGeom>
+                  </pic:spPr>
+                </pic:pic>
+              </a:graphicData>
+            </a:graphic>
+          </wp:inline>
+        </w:drawing>
       </w:r>
     </w:p>
     <w:p/>

</xml_diff>